<commit_message>
Dashboards and Indicator framework policy_purpose update
</commit_message>
<xml_diff>
--- a/Exports/docx/WORKBOOK_WRITE_PROTOCOL.docx
+++ b/Exports/docx/WORKBOOK_WRITE_PROTOCOL.docx
@@ -774,7 +774,67 @@
       </w:r>
       <w:r>
         <w:rPr/>
-        <w:t xml:space="preserve"> codes per indicator; governance records uncapped.</w:t>
+        <w:t xml:space="preserve"> codes per indicator; governance records uncapped. </w:t>
+      </w:r>
+      <w:r>
+        <w:rPr>
+          <w:rFonts w:ascii="Consolas" w:hAnsi="Consolas"/>
+        </w:rPr>
+        <w:t>Policy_Sector</w:t>
+      </w:r>
+      <w:r>
+        <w:rPr/>
+        <w:t xml:space="preserve"> is </w:t>
+      </w:r>
+      <w:r>
+        <w:rPr>
+          <w:b/>
+        </w:rPr>
+        <w:t>one vocabulary of 14 classes shared by all three workbooks</w:t>
+      </w:r>
+      <w:r>
+        <w:rPr/>
+        <w:t xml:space="preserve"> — indicators and governance alike. Do not fork it per workbook: the indicator finder and the governance diagram both filter on it, and </w:t>
+      </w:r>
+      <w:r>
+        <w:rPr>
+          <w:rFonts w:ascii="Consolas" w:hAnsi="Consolas"/>
+        </w:rPr>
+        <w:t>Health</w:t>
+      </w:r>
+      <w:r>
+        <w:rPr/>
+        <w:t xml:space="preserve"> / </w:t>
+      </w:r>
+      <w:r>
+        <w:rPr>
+          <w:rFonts w:ascii="Consolas" w:hAnsi="Consolas"/>
+        </w:rPr>
+        <w:t>Trade &amp; Industry</w:t>
+      </w:r>
+      <w:r>
+        <w:rPr/>
+        <w:t xml:space="preserve"> are indicator-only in </w:t>
+      </w:r>
+      <w:r>
+        <w:rPr>
+          <w:i/>
+        </w:rPr>
+        <w:t>use</w:t>
+      </w:r>
+      <w:r>
+        <w:rPr/>
+        <w:t xml:space="preserve">, not indicator-only in </w:t>
+      </w:r>
+      <w:r>
+        <w:rPr>
+          <w:i/>
+        </w:rPr>
+        <w:t>scope</w:t>
+      </w:r>
+      <w:r>
+        <w:rPr/>
+        <w:t>. The authoritative list is handover §5.</w:t>
       </w:r>
     </w:p>
     <w:p>
@@ -2653,6 +2713,61 @@
                 <w:rFonts w:ascii="Consolas" w:hAnsi="Consolas"/>
                 <w:sz w:val="18"/>
               </w:rPr>
+              <w:t>Key_Instruments</w:t>
+            </w:r>
+            <w:r>
+              <w:rPr>
+                <w:sz w:val="18"/>
+              </w:rPr>
+              <w:t xml:space="preserve"> (Indicator Framework sheet)</w:t>
+            </w:r>
+          </w:p>
+        </w:tc>
+        <w:tc>
+          <w:tcPr>
+            <w:tcW w:type="dxa" w:w="3213"/>
+          </w:tcPr>
+          <w:p>
+            <w:r>
+              <w:rPr>
+                <w:sz w:val="18"/>
+              </w:rPr>
+              <w:t>key instrument</w:t>
+            </w:r>
+          </w:p>
+        </w:tc>
+        <w:tc>
+          <w:tcPr>
+            <w:tcW w:type="dxa" w:w="3213"/>
+          </w:tcPr>
+          <w:p>
+            <w:r>
+              <w:rPr>
+                <w:b/>
+                <w:sz w:val="18"/>
+              </w:rPr>
+              <w:t>solid</w:t>
+            </w:r>
+            <w:r>
+              <w:rPr>
+                <w:sz w:val="18"/>
+              </w:rPr>
+              <w:t xml:space="preserve"> · IFW → instrument</w:t>
+            </w:r>
+          </w:p>
+        </w:tc>
+      </w:tr>
+      <w:tr>
+        <w:tc>
+          <w:tcPr>
+            <w:tcW w:type="dxa" w:w="3213"/>
+          </w:tcPr>
+          <w:p>
+            <w:r>
+              <w:rPr>
+                <w:rFonts w:ascii="Consolas" w:hAnsi="Consolas"/>
+                <w:sz w:val="18"/>
+              </w:rPr>
               <w:t>Indicator_Frameworks</w:t>
             </w:r>
             <w:r>
@@ -2699,6 +2814,91 @@
       </w:tr>
     </w:tbl>
     <w:p/>
+    <w:p>
+      <w:r>
+        <w:rPr>
+          <w:b/>
+        </w:rPr>
+        <w:t xml:space="preserve">Precedence on an </w:t>
+      </w:r>
+      <w:r>
+        <w:rPr>
+          <w:rFonts w:ascii="Consolas" w:hAnsi="Consolas"/>
+          <w:b/>
+        </w:rPr>
+        <w:t>IFW</w:t>
+      </w:r>
+      <w:r>
+        <w:rPr>
+          <w:b/>
+        </w:rPr>
+        <w:t xml:space="preserve"> row.</w:t>
+      </w:r>
+      <w:r>
+        <w:rPr/>
+        <w:t xml:space="preserve"> A code carrying a </w:t>
+      </w:r>
+      <w:r>
+        <w:rPr>
+          <w:rFonts w:ascii="Consolas" w:hAnsi="Consolas"/>
+        </w:rPr>
+        <w:t>lead</w:t>
+      </w:r>
+      <w:r>
+        <w:rPr/>
+        <w:t xml:space="preserve"> edge keeps it (already solid). Remaining </w:t>
+      </w:r>
+      <w:r>
+        <w:rPr>
+          <w:rFonts w:ascii="Consolas" w:hAnsi="Consolas"/>
+        </w:rPr>
+        <w:t>Key_Instruments</w:t>
+      </w:r>
+      <w:r>
+        <w:rPr/>
+        <w:t xml:space="preserve"> codes take precedence over the dotted </w:t>
+      </w:r>
+      <w:r>
+        <w:rPr>
+          <w:rFonts w:ascii="Consolas" w:hAnsi="Consolas"/>
+        </w:rPr>
+        <w:t>indicator</w:t>
+      </w:r>
+      <w:r>
+        <w:rPr/>
+        <w:t xml:space="preserve"> edge. Anything left in </w:t>
+      </w:r>
+      <w:r>
+        <w:rPr>
+          <w:rFonts w:ascii="Consolas" w:hAnsi="Consolas"/>
+        </w:rPr>
+        <w:t>Indirect_Policy_Links</w:t>
+      </w:r>
+      <w:r>
+        <w:rPr/>
+        <w:t xml:space="preserve"> stays dotted. </w:t>
+      </w:r>
+      <w:r>
+        <w:rPr>
+          <w:rFonts w:ascii="Consolas" w:hAnsi="Consolas"/>
+        </w:rPr>
+        <w:t>Key_Instruments</w:t>
+      </w:r>
+      <w:r>
+        <w:rPr/>
+        <w:t xml:space="preserve"> holds bracketed codes ONLY — no names — for the instruments named in that framework’s </w:t>
+      </w:r>
+      <w:r>
+        <w:rPr>
+          <w:rFonts w:ascii="Consolas" w:hAnsi="Consolas"/>
+        </w:rPr>
+        <w:t>Policy_Purpose</w:t>
+      </w:r>
+      <w:r>
+        <w:rPr/>
+        <w:t>.</w:t>
+      </w:r>
+    </w:p>
     <w:p>
       <w:r>
         <w:rPr/>

</xml_diff>

<commit_message>
Housekeeping: remove superseded outputs, fix stale doc references
- Remove applied or superseded working files from outputs_other/:
  2026-10-06 workbook and MCCIP proposal folders, policy goal summary
  review (applied in indicators v15), September triage workbooks (carried
  into the pending queue), stale orphan_codes.py output, export scoping
  note, MCCIP draft workbook; remove move_manifest.md
- Drop citations of removed files from pending_additions.md and the
  orphan-code promotion analysis
- WORKBOOK_WRITE_PROTOCOL: list actual indicator ID prefixes; Policy_Sector
  list is handover section 8
- check_links.py docstring and requirements.txt comment brought up to date
- build_governance_diagram.py: sort edge codes so rebuilds are
  deterministic
- PA_toolkit templates: footer workbook version is a vNN placeholder

Co-Authored-By: Claude Opus 5.5 <noreply@anthropic.com>
Claude-Session: https://claude.ai/code/session_01AXpUr5Jv7F4hv6YdhfHEwx
</commit_message>
<xml_diff>
--- a/Exports/docx/WORKBOOK_WRITE_PROTOCOL.docx
+++ b/Exports/docx/WORKBOOK_WRITE_PROTOCOL.docx
@@ -486,7 +486,150 @@
                 <w:rFonts w:ascii="Consolas" w:hAnsi="Consolas"/>
                 <w:sz w:val="18"/>
               </w:rPr>
-              <w:t>IND-x-NNN</w:t>
+              <w:t>IND-E-</w:t>
+            </w:r>
+            <w:r>
+              <w:rPr>
+                <w:sz w:val="18"/>
+              </w:rPr>
+              <w:t xml:space="preserve">, </w:t>
+            </w:r>
+            <w:r>
+              <w:rPr>
+                <w:rFonts w:ascii="Consolas" w:hAnsi="Consolas"/>
+                <w:sz w:val="18"/>
+              </w:rPr>
+              <w:t>IND-C-</w:t>
+            </w:r>
+            <w:r>
+              <w:rPr>
+                <w:sz w:val="18"/>
+              </w:rPr>
+              <w:t xml:space="preserve">, </w:t>
+            </w:r>
+            <w:r>
+              <w:rPr>
+                <w:rFonts w:ascii="Consolas" w:hAnsi="Consolas"/>
+                <w:sz w:val="18"/>
+              </w:rPr>
+              <w:t>IND-J-</w:t>
+            </w:r>
+            <w:r>
+              <w:rPr>
+                <w:sz w:val="18"/>
+              </w:rPr>
+              <w:t xml:space="preserve">, </w:t>
+            </w:r>
+            <w:r>
+              <w:rPr>
+                <w:rFonts w:ascii="Consolas" w:hAnsi="Consolas"/>
+                <w:sz w:val="18"/>
+              </w:rPr>
+              <w:t>IND-S-</w:t>
+            </w:r>
+            <w:r>
+              <w:rPr>
+                <w:sz w:val="18"/>
+              </w:rPr>
+              <w:t xml:space="preserve">, </w:t>
+            </w:r>
+            <w:r>
+              <w:rPr>
+                <w:rFonts w:ascii="Consolas" w:hAnsi="Consolas"/>
+                <w:sz w:val="18"/>
+              </w:rPr>
+              <w:t>IND-B-</w:t>
+            </w:r>
+            <w:r>
+              <w:rPr>
+                <w:sz w:val="18"/>
+              </w:rPr>
+              <w:t xml:space="preserve">, </w:t>
+            </w:r>
+            <w:r>
+              <w:rPr>
+                <w:rFonts w:ascii="Consolas" w:hAnsi="Consolas"/>
+                <w:sz w:val="18"/>
+              </w:rPr>
+              <w:t>IND-M-NNN</w:t>
+            </w:r>
+            <w:r>
+              <w:rPr>
+                <w:sz w:val="18"/>
+              </w:rPr>
+              <w:t xml:space="preserve">; </w:t>
+            </w:r>
+            <w:r>
+              <w:rPr>
+                <w:rFonts w:ascii="Consolas" w:hAnsi="Consolas"/>
+                <w:sz w:val="18"/>
+              </w:rPr>
+              <w:t>BIP-</w:t>
+            </w:r>
+            <w:r>
+              <w:rPr>
+                <w:sz w:val="18"/>
+              </w:rPr>
+              <w:t xml:space="preserve">, </w:t>
+            </w:r>
+            <w:r>
+              <w:rPr>
+                <w:rFonts w:ascii="Consolas" w:hAnsi="Consolas"/>
+                <w:sz w:val="18"/>
+              </w:rPr>
+              <w:t>GBF-</w:t>
+            </w:r>
+            <w:r>
+              <w:rPr>
+                <w:sz w:val="18"/>
+              </w:rPr>
+              <w:t xml:space="preserve">, </w:t>
+            </w:r>
+            <w:r>
+              <w:rPr>
+                <w:rFonts w:ascii="Consolas" w:hAnsi="Consolas"/>
+                <w:sz w:val="18"/>
+              </w:rPr>
+              <w:t>SDG-</w:t>
+            </w:r>
+            <w:r>
+              <w:rPr>
+                <w:sz w:val="18"/>
+              </w:rPr>
+              <w:t xml:space="preserve"> codes; </w:t>
+            </w:r>
+            <w:r>
+              <w:rPr>
+                <w:rFonts w:ascii="Consolas" w:hAnsi="Consolas"/>
+                <w:sz w:val="18"/>
+              </w:rPr>
+              <w:t>IPBES-N-</w:t>
+            </w:r>
+            <w:r>
+              <w:rPr>
+                <w:sz w:val="18"/>
+              </w:rPr>
+              <w:t xml:space="preserve">, </w:t>
+            </w:r>
+            <w:r>
+              <w:rPr>
+                <w:rFonts w:ascii="Consolas" w:hAnsi="Consolas"/>
+                <w:sz w:val="18"/>
+              </w:rPr>
+              <w:t>IPBES-NCP-</w:t>
+            </w:r>
+            <w:r>
+              <w:rPr>
+                <w:sz w:val="18"/>
+              </w:rPr>
+              <w:t xml:space="preserve">, </w:t>
+            </w:r>
+            <w:r>
+              <w:rPr>
+                <w:rFonts w:ascii="Consolas" w:hAnsi="Consolas"/>
+                <w:sz w:val="18"/>
+              </w:rPr>
+              <w:t>IPBES-D-NNN</w:t>
             </w:r>
           </w:p>
         </w:tc>
@@ -889,7 +1032,7 @@
       </w:r>
       <w:r>
         <w:rPr/>
-        <w:t>. The authoritative list is handover §5.</w:t>
+        <w:t>. The authoritative list is handover §8.</w:t>
       </w:r>
     </w:p>
     <w:p>

</xml_diff>